<commit_message>
Regenerate overview docx exports from current markdown
The exported .docx files were stale, still reflecting the app/role
overview markdown from before the Jul 27 update (waitlist auto-offer
emails, account recovery flow, event-card registration shortcuts,
manual waitlist promotion).

Co-Authored-By: Claude Sonnet 5 <noreply@anthropic.com>
</commit_message>
<xml_diff>
--- a/exports/VQ_Event_Management_App_Overview.docx
+++ b/exports/VQ_Event_Management_App_Overview.docx
@@ -86,7 +86,7 @@
         </w:pBdr>
       </w:pPr>
       <w:r>
-        <w:t xml:space="preserve">Prepared: July 24, 2026</w:t>
+        <w:t xml:space="preserve">Prepared: July 28, 2026</w:t>
       </w:r>
     </w:p>
     <w:p>
@@ -255,6 +255,14 @@
         <w:pStyle w:val="BodyText"/>
       </w:pPr>
       <w:r>
+        <w:t xml:space="preserve">Members who forget their password or which email they signed up with can recover access from the login page with a single field - an email address or a phone number - and an emailed code, without needing to remember or guess which one they used. Verifying the code signs them in and takes them straight to their profile to set a new password.</w:t>
+      </w:r>
+    </w:p>
+    <w:p>
+      <w:pPr>
+        <w:pStyle w:val="BodyText"/>
+      </w:pPr>
+      <w:r>
         <w:t xml:space="preserve">Signed-in members can also:</w:t>
       </w:r>
     </w:p>
@@ -351,6 +359,14 @@
         <w:pStyle w:val="ListParagraph"/>
       </w:pPr>
       <w:r>
+        <w:t xml:space="preserve">•  Jump directly from an event card to that event's registrations, or to register a member for it, without hunting for the event in a separate module</w:t>
+      </w:r>
+    </w:p>
+    <w:p>
+      <w:pPr>
+        <w:pStyle w:val="ListParagraph"/>
+      </w:pPr>
+      <w:r>
         <w:t xml:space="preserve">•  Review registrations by event, year, quarter, and activity type</w:t>
       </w:r>
     </w:p>
@@ -375,6 +391,22 @@
         <w:pStyle w:val="ListParagraph"/>
       </w:pPr>
       <w:r>
+        <w:t xml:space="preserve">•  Cancel free or unpaid registrations directly from the registration edit card</w:t>
+      </w:r>
+    </w:p>
+    <w:p>
+      <w:pPr>
+        <w:pStyle w:val="ListParagraph"/>
+      </w:pPr>
+      <w:r>
+        <w:t xml:space="preserve">•  Manually promote someone off a waitlist, in addition to the app's automatic waitlist offers</w:t>
+      </w:r>
+    </w:p>
+    <w:p>
+      <w:pPr>
+        <w:pStyle w:val="ListParagraph"/>
+      </w:pPr>
+      <w:r>
         <w:t xml:space="preserve">•  Record cash, check, waived, no-charge, and refund information</w:t>
       </w:r>
     </w:p>
@@ -516,6 +548,14 @@
     </w:p>
     <w:p>
       <w:pPr>
+        <w:pStyle w:val="BodyText"/>
+      </w:pPr>
+      <w:r>
+        <w:t xml:space="preserve">When a seat opens up after a cancellation or refund, the app automatically emails the next person on that event's waitlist an offer to claim it themselves - they are never automatically registered or charged. They have a few days to claim it before the offer moves on to the next person. If nobody is left on the waitlist, the event's coordinator is notified instead.</w:t>
+      </w:r>
+    </w:p>
+    <w:p>
+      <w:pPr>
         <w:pStyle w:val="Heading1"/>
       </w:pPr>
       <w:r>
@@ -591,6 +631,25 @@
         <w:pStyle w:val="BodyText"/>
       </w:pPr>
       <w:r>
+        <w:t xml:space="preserve">Free (</w:t>
+      </w:r>
+      <w:r>
+        <w:rPr>
+          <w:rFonts w:ascii="Consolas" w:hAnsi="Consolas"/>
+          <w:color w:val="8A4B00"/>
+          <w:shd w:val="clear" w:color="auto" w:fill="FFF1DF"/>
+        </w:rPr>
+        <w:t xml:space="preserve">No Charge</w:t>
+      </w:r>
+      <w:r>
+        <w:t xml:space="preserve">) and other unpaid active registrations can be cancelled directly from the registration edit card without using the refund flow. Cancellation returns the seat and notifies the registrant when confirmation emails are enabled.</w:t>
+      </w:r>
+    </w:p>
+    <w:p>
+      <w:pPr>
+        <w:pStyle w:val="BodyText"/>
+      </w:pPr>
+      <w:r>
         <w:t xml:space="preserve">Square webhooks are signed and recorded. Completed payment and refund events are reconciled automatically when possible, and unmatched items are routed to Payment Review.</w:t>
       </w:r>
     </w:p>
@@ -695,7 +754,26 @@
         <w:pStyle w:val="ListParagraph"/>
       </w:pPr>
       <w:r>
-        <w:t xml:space="preserve">•  Server-side Firebase Admin routes for registration creation and sensitive payment/refund operations</w:t>
+        <w:t xml:space="preserve">•  Server-side Firebase Admin routes for registration creation, event writes, and sensitive payment/refund/cancellation operations</w:t>
+      </w:r>
+    </w:p>
+    <w:p>
+      <w:pPr>
+        <w:pStyle w:val="ListParagraph"/>
+      </w:pPr>
+      <w:r>
+        <w:t xml:space="preserve">•  Directory-safe </w:t>
+      </w:r>
+      <w:r>
+        <w:rPr>
+          <w:rFonts w:ascii="Consolas" w:hAnsi="Consolas"/>
+          <w:color w:val="8A4B00"/>
+          <w:shd w:val="clear" w:color="auto" w:fill="FFF1DF"/>
+        </w:rPr>
+        <w:t xml:space="preserve">memberDirectoryProfiles</w:t>
+      </w:r>
+      <w:r>
+        <w:t xml:space="preserve"> projections for member directory reads</w:t>
       </w:r>
     </w:p>
     <w:p>
@@ -719,7 +797,7 @@
         <w:pStyle w:val="ListParagraph"/>
       </w:pPr>
       <w:r>
-        <w:t xml:space="preserve">•  Private seat reservation and registration attempt collections</w:t>
+        <w:t xml:space="preserve">•  Private seat reservation, registration attempt, and API rate-limit collections</w:t>
       </w:r>
     </w:p>
     <w:p>
@@ -735,6 +813,22 @@
         <w:pStyle w:val="ListParagraph"/>
       </w:pPr>
       <w:r>
+        <w:t xml:space="preserve">•  Production security headers (CSP, frame protection, referrer policy, and related policies)</w:t>
+      </w:r>
+    </w:p>
+    <w:p>
+      <w:pPr>
+        <w:pStyle w:val="ListParagraph"/>
+      </w:pPr>
+      <w:r>
+        <w:t xml:space="preserve">•  Privacy and support pages for member/registrant information questions</w:t>
+      </w:r>
+    </w:p>
+    <w:p>
+      <w:pPr>
+        <w:pStyle w:val="ListParagraph"/>
+      </w:pPr>
+      <w:r>
         <w:t xml:space="preserve">•  Environment variables for Firebase, Square, and Resend secrets</w:t>
       </w:r>
     </w:p>
@@ -751,7 +845,7 @@
         <w:pStyle w:val="BodyText"/>
       </w:pPr>
       <w:r>
-        <w:t xml:space="preserve">The current system already protects direct browser registration creation. Future hardening priorities include broader rate limiting, production security headers, a directory-safe member collection, and more automated rules/workflow tests.</w:t>
+        <w:t xml:space="preserve">The current system already protects direct browser registration and event creation. Remaining hardening includes finishing server-side membership/config writes, abuse monitoring/alerts, and broader automated rules/workflow tests.</w:t>
       </w:r>
     </w:p>
     <w:p>

</xml_diff>